<commit_message>
Respond to reviewers' comments
</commit_message>
<xml_diff>
--- a/submission/cover_letter.docx
+++ b/submission/cover_letter.docx
@@ -10,17 +10,6 @@
           <w:szCs w:val="16"/>
         </w:rPr>
       </w:pPr>
-    </w:p>
-    <w:p>
-      <w:pPr>
-        <w:tabs>
-          <w:tab w:val="right" w:pos="9360"/>
-        </w:tabs>
-        <w:rPr>
-          <w:rFonts w:cs="Arial"/>
-          <w:szCs w:val="22"/>
-        </w:rPr>
-      </w:pPr>
       <w:r>
         <w:rPr>
           <w:rFonts w:cs="Arial"/>
@@ -31,25 +20,25 @@
         <mc:AlternateContent>
           <mc:Choice Requires="wpg">
             <w:drawing>
-              <wp:anchor distT="0" distB="0" distL="114300" distR="114300" simplePos="0" relativeHeight="251660288" behindDoc="0" locked="0" layoutInCell="1" allowOverlap="1" wp14:anchorId="6C68BE77" wp14:editId="095FC6AE">
+              <wp:anchor distT="0" distB="0" distL="114300" distR="114300" simplePos="0" relativeHeight="251660288" behindDoc="0" locked="0" layoutInCell="1" allowOverlap="1" wp14:anchorId="6C68BE77" wp14:editId="0D8EAD88">
                 <wp:simplePos x="0" y="0"/>
                 <wp:positionH relativeFrom="column">
                   <wp:posOffset>45085</wp:posOffset>
                 </wp:positionH>
                 <wp:positionV relativeFrom="paragraph">
-                  <wp:posOffset>-1116965</wp:posOffset>
+                  <wp:posOffset>-917526</wp:posOffset>
                 </wp:positionV>
                 <wp:extent cx="5949950" cy="1119505"/>
-                <wp:effectExtent l="0" t="0" r="0" b="0"/>
+                <wp:effectExtent l="0" t="0" r="6350" b="0"/>
                 <wp:wrapThrough wrapText="bothSides">
                   <wp:wrapPolygon edited="0">
-                    <wp:start x="6455" y="0"/>
+                    <wp:start x="6593" y="0"/>
                     <wp:lineTo x="0" y="980"/>
-                    <wp:lineTo x="0" y="20093"/>
-                    <wp:lineTo x="6455" y="21073"/>
-                    <wp:lineTo x="21485" y="21073"/>
-                    <wp:lineTo x="21485" y="0"/>
-                    <wp:lineTo x="6455" y="0"/>
+                    <wp:lineTo x="0" y="19848"/>
+                    <wp:lineTo x="6593" y="21318"/>
+                    <wp:lineTo x="21577" y="21318"/>
+                    <wp:lineTo x="21577" y="0"/>
+                    <wp:lineTo x="6593" y="0"/>
                   </wp:wrapPolygon>
                 </wp:wrapThrough>
                 <wp:docPr id="5" name="Group 5"/>
@@ -91,7 +80,7 @@
                           </a:ln>
                           <a:extLst>
                             <a:ext uri="{91240B29-F687-4f45-9708-019B960494DF}">
-                              <a14:hiddenLine xmlns:a14="http://schemas.microsoft.com/office/drawing/2010/main" xmlns:w="http://schemas.openxmlformats.org/wordprocessingml/2006/main" xmlns:w10="urn:schemas-microsoft-com:office:word" xmlns:v="urn:schemas-microsoft-com:vml" xmlns:o="urn:schemas-microsoft-com:office:office" xmlns:mv="urn:schemas-microsoft-com:mac:vml" xmlns:mo="http://schemas.microsoft.com/office/mac/office/2008/main" xmlns="" w="9525">
+                              <a14:hiddenLine xmlns="" xmlns:mo="http://schemas.microsoft.com/office/mac/office/2008/main" xmlns:mv="urn:schemas-microsoft-com:mac:vml" xmlns:o="urn:schemas-microsoft-com:office:office" xmlns:v="urn:schemas-microsoft-com:vml" xmlns:w10="urn:schemas-microsoft-com:office:word" xmlns:w="http://schemas.openxmlformats.org/wordprocessingml/2006/main" xmlns:a14="http://schemas.microsoft.com/office/drawing/2010/main" w="9525">
                                 <a:solidFill>
                                   <a:srgbClr val="000000"/>
                                 </a:solidFill>
@@ -267,7 +256,7 @@
                           <a:noFill/>
                           <a:extLst>
                             <a:ext uri="{909E8E84-426E-40dd-AFC4-6F175D3DCCD1}">
-                              <a14:hiddenFill xmlns:a14="http://schemas.microsoft.com/office/drawing/2010/main" xmlns:w="http://schemas.openxmlformats.org/wordprocessingml/2006/main" xmlns:w10="urn:schemas-microsoft-com:office:word" xmlns:v="urn:schemas-microsoft-com:vml" xmlns:o="urn:schemas-microsoft-com:office:office" xmlns:mv="urn:schemas-microsoft-com:mac:vml" xmlns:mo="http://schemas.microsoft.com/office/mac/office/2008/main" xmlns="">
+                              <a14:hiddenFill xmlns="" xmlns:mo="http://schemas.microsoft.com/office/mac/office/2008/main" xmlns:mv="urn:schemas-microsoft-com:mac:vml" xmlns:o="urn:schemas-microsoft-com:office:office" xmlns:v="urn:schemas-microsoft-com:vml" xmlns:w10="urn:schemas-microsoft-com:office:word" xmlns:w="http://schemas.openxmlformats.org/wordprocessingml/2006/main" xmlns:a14="http://schemas.microsoft.com/office/drawing/2010/main">
                                 <a:solidFill>
                                   <a:srgbClr val="FFFFFF"/>
                                 </a:solidFill>
@@ -290,7 +279,7 @@
           </mc:Choice>
           <mc:Fallback>
             <w:pict>
-              <v:group w14:anchorId="6C68BE77" id="Group 5" o:spid="_x0000_s1026" style="position:absolute;left:0;text-align:left;margin-left:3.55pt;margin-top:-87.95pt;width:468.5pt;height:88.15pt;z-index:251660288" coordorigin="1511,445" coordsize="9370,1763" o:gfxdata="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">
+              <v:group w14:anchorId="6C68BE77" id="Group 5" o:spid="_x0000_s1026" style="position:absolute;left:0;text-align:left;margin-left:3.55pt;margin-top:-72.25pt;width:468.5pt;height:88.15pt;z-index:251660288" coordorigin="1511,445" coordsize="9370,1763" o:gfxdata="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">
                 <v:shapetype id="_x0000_t202" coordsize="21600,21600" o:spt="202" path="m,l,21600r21600,l21600,xe">
                   <v:stroke joinstyle="miter"/>
                   <v:path gradientshapeok="t" o:connecttype="rect"/>
@@ -456,6 +445,17 @@
           </mc:Fallback>
         </mc:AlternateContent>
       </w:r>
+    </w:p>
+    <w:p>
+      <w:pPr>
+        <w:tabs>
+          <w:tab w:val="right" w:pos="9360"/>
+        </w:tabs>
+        <w:rPr>
+          <w:rFonts w:cs="Arial"/>
+          <w:szCs w:val="22"/>
+        </w:rPr>
+      </w:pPr>
       <w:r>
         <w:rPr>
           <w:rFonts w:cs="Arial"/>

</xml_diff>